<commit_message>
updated instructions for s3 lab
</commit_message>
<xml_diff>
--- a/08_aws_services/lab_amazon_s3/lab_instructions_amazon_s3.docx
+++ b/08_aws_services/lab_amazon_s3/lab_instructions_amazon_s3.docx
@@ -11,24 +11,24 @@
         <w:rPr/>
         <w:t>University of Virginia Data Science</w:t>
         <w:br/>
-        <w:t xml:space="preserve">DS </w:t>
-      </w:r>
-      <w:r>
-        <w:rPr/>
-        <w:t>7200 Distributed Computing</w:t>
-      </w:r>
-      <w:r>
-        <w:rPr/>
+        <w:t>DS 7200 Distributed Computing</w:t>
         <w:br/>
         <w:t xml:space="preserve">Last updated: </w:t>
       </w:r>
       <w:r>
         <w:rPr/>
-        <w:t>October 7,</w:t>
-      </w:r>
-      <w:r>
-        <w:rPr/>
-        <w:t xml:space="preserve"> 2021</w:t>
+        <w:t>September 22</w:t>
+      </w:r>
+      <w:r>
+        <w:rPr/>
+        <w:t>, 202</w:t>
+      </w:r>
+      <w:r>
+        <w:rPr/>
+        <w:t>6</w:t>
+      </w:r>
+      <w:r>
+        <w:rPr/>
         <w:br/>
         <w:br/>
         <w:t xml:space="preserve">Assignment: Hosting a Static Website on Amazon S3 </w:t>
@@ -128,7 +128,7 @@
       </w:pPr>
       <w:r>
         <w:rPr/>
-        <w:t>4) (1 PT) Set public access permissions on your bucket. Include a screenshot that shows your bucket name, with the text “Publicly accessible.”</w:t>
+        <w:t xml:space="preserve">4) (1 PT) Set public access permissions on your bucket. Include a screenshot that shows your bucket name with evidence of public access permission. </w:t>
       </w:r>
     </w:p>
     <w:p>
@@ -223,6 +223,7 @@
     <w:qFormat/>
     <w:pPr>
       <w:widowControl/>
+      <w:suppressAutoHyphens w:val="true"/>
       <w:bidi w:val="0"/>
       <w:spacing w:before="0" w:after="0"/>
       <w:jc w:val="left"/>

</xml_diff>

<commit_message>
added note to s3 lab
</commit_message>
<xml_diff>
--- a/08_aws_services/lab_amazon_s3/lab_instructions_amazon_s3.docx
+++ b/08_aws_services/lab_amazon_s3/lab_instructions_amazon_s3.docx
@@ -17,18 +17,11 @@
       </w:r>
       <w:r>
         <w:rPr/>
-        <w:t>September 22</w:t>
-      </w:r>
-      <w:r>
-        <w:rPr/>
-        <w:t>, 202</w:t>
-      </w:r>
-      <w:r>
-        <w:rPr/>
-        <w:t>6</w:t>
-      </w:r>
-      <w:r>
-        <w:rPr/>
+        <w:t>October 28</w:t>
+      </w:r>
+      <w:r>
+        <w:rPr/>
+        <w:t>, 2026</w:t>
         <w:br/>
         <w:br/>
         <w:t xml:space="preserve">Assignment: Hosting a Static Website on Amazon S3 </w:t>
@@ -167,6 +160,25 @@
       <w:r>
         <w:rPr/>
         <w:t>6) (2 PTS) Visit the URL of your webpage, making sure to include the correct bucket name and region in the URL. Include a screenshot of the webpage.</w:t>
+      </w:r>
+    </w:p>
+    <w:p>
+      <w:pPr>
+        <w:pStyle w:val="Normal"/>
+        <w:rPr/>
+      </w:pPr>
+      <w:r>
+        <w:rPr/>
+      </w:r>
+    </w:p>
+    <w:p>
+      <w:pPr>
+        <w:pStyle w:val="Normal"/>
+        <w:rPr/>
+      </w:pPr>
+      <w:r>
+        <w:rPr/>
+        <w:t>7) Empty and delete the S3 bucket</w:t>
       </w:r>
     </w:p>
     <w:p>

</xml_diff>